<commit_message>
Remove unneeded references and reproduction notes from lab 5 report
</commit_message>
<xml_diff>
--- a/docs/实验五_RecyclerView翻牌游戏_实验报告_2024110131宋珺熠.docx
+++ b/docs/实验五_RecyclerView翻牌游戏_实验报告_2024110131宋珺熠.docx
@@ -2859,14 +2859,14 @@
       </w:pPr>
       <w:r>
         <w:rPr>
-          <w:rFonts w:hint="default" w:ascii="Times New Roman" w:hAnsi="Times New Roman" w:eastAsia="宋体" w:cs="Times New Roman"/>
+          <w:rFonts w:hint="eastAsia" w:cs="Times New Roman"/>
           <w:b/>
           <w:color w:val="000000"/>
           <w:sz w:val="24"/>
           <w:u w:val="none"/>
           <w:lang w:eastAsia="zh-CN"/>
         </w:rPr>
-        <w:t>3 实验体会与复现</w:t>
+        <w:t>3 实验体会</w:t>
       </w:r>
     </w:p>
     <w:p>
@@ -2903,114 +2903,6 @@
           <w:lang w:eastAsia="zh-CN"/>
         </w:rPr>
         <w:t>通过本实验，我把三牌规则放在模型层，通过适配器回调连接控制器，而没有把计分写进按钮。模型测试可以精确验证奖励与扣分，设备测试补充验证列表复用、菜单、导航和重建。Git分支保护把合并集中到PR中，个人自审记录与独立批准也应如实区分。</w:t>
-      </w:r>
-    </w:p>
-    <w:p>
-      <w:pPr>
-        <w:keepNext w:val="0"/>
-        <w:keepLines w:val="0"/>
-        <w:pageBreakBefore w:val="0"/>
-        <w:pBdr>
-          <w:top w:val="none" w:color="auto" w:sz="0" w:space="0"/>
-          <w:left w:val="none" w:color="auto" w:sz="0" w:space="0"/>
-          <w:bottom w:val="none" w:color="auto" w:sz="0" w:space="0"/>
-          <w:right w:val="none" w:color="auto" w:sz="0" w:space="0"/>
-          <w:between w:val="none" w:color="auto" w:sz="0" w:space="0"/>
-        </w:pBdr>
-        <w:spacing w:after="120" w:line="240" w:lineRule="auto"/>
-        <w:ind w:left="0" w:right="0" w:firstLine="0"/>
-        <w:jc w:val="left"/>
-        <w:rPr>
-          <w:rFonts w:hint="default" w:ascii="Times New Roman" w:hAnsi="Times New Roman" w:eastAsia="宋体" w:cs="Times New Roman"/>
-          <w:b w:val="0"/>
-          <w:color w:val="000000"/>
-          <w:sz w:val="21"/>
-          <w:u w:val="none"/>
-          <w:lang w:eastAsia="zh-CN"/>
-        </w:rPr>
-      </w:pPr>
-      <w:r>
-        <w:rPr>
-          <w:rFonts w:hint="default" w:ascii="Times New Roman" w:hAnsi="Times New Roman" w:eastAsia="宋体" w:cs="Times New Roman"/>
-          <w:b w:val="0"/>
-          <w:color w:val="000000"/>
-          <w:sz w:val="21"/>
-          <w:u w:val="none"/>
-          <w:lang w:eastAsia="zh-CN"/>
-        </w:rPr>
-        <w:t>Android Studio打开 C:\Users\48604\Documents\ChatGPT\android-labs\assignment5-project。安装SDK 35并启动API 35模拟器后运行app。工作区assignment5-recyclerview是指向该目录的链接，不是实验四目录，也不依赖临时盘符。</w:t>
-      </w:r>
-    </w:p>
-    <w:p>
-      <w:pPr>
-        <w:keepNext w:val="0"/>
-        <w:keepLines w:val="0"/>
-        <w:pageBreakBefore w:val="0"/>
-        <w:pBdr>
-          <w:top w:val="none" w:color="auto" w:sz="0" w:space="0"/>
-          <w:left w:val="none" w:color="auto" w:sz="0" w:space="0"/>
-          <w:bottom w:val="none" w:color="auto" w:sz="0" w:space="0"/>
-          <w:right w:val="none" w:color="auto" w:sz="0" w:space="0"/>
-          <w:between w:val="none" w:color="auto" w:sz="0" w:space="0"/>
-        </w:pBdr>
-        <w:spacing w:after="120" w:line="240" w:lineRule="auto"/>
-        <w:ind w:left="0" w:right="0" w:firstLine="0"/>
-        <w:jc w:val="left"/>
-        <w:rPr>
-          <w:rFonts w:hint="default" w:ascii="Times New Roman" w:hAnsi="Times New Roman" w:eastAsia="宋体" w:cs="Times New Roman"/>
-          <w:b w:val="0"/>
-          <w:color w:val="000000"/>
-          <w:sz w:val="21"/>
-          <w:u w:val="none"/>
-          <w:lang w:eastAsia="zh-CN"/>
-        </w:rPr>
-      </w:pPr>
-      <w:r>
-        <w:rPr>
-          <w:rFonts w:hint="default" w:ascii="Times New Roman" w:hAnsi="Times New Roman" w:eastAsia="宋体" w:cs="Times New Roman"/>
-          <w:b w:val="0"/>
-          <w:color w:val="000000"/>
-          <w:sz w:val="21"/>
-          <w:u w:val="none"/>
-          <w:lang w:eastAsia="zh-CN"/>
-        </w:rPr>
-        <w:t>复现命令：gradlew.bat :app:assembleDebug :app:testDebugUnitTest :app:connectedDebugAndroidTest :app:lintDebug。首次需要联网，缓存齐全后可加--offline。设备测试的本机验证与GitHub提交状态分别记录，报告通过WPS接口填写并导出检查。</w:t>
-      </w:r>
-    </w:p>
-    <w:p>
-      <w:pPr>
-        <w:keepNext w:val="0"/>
-        <w:keepLines w:val="0"/>
-        <w:pageBreakBefore w:val="0"/>
-        <w:pBdr>
-          <w:top w:val="none" w:color="auto" w:sz="0" w:space="0"/>
-          <w:left w:val="none" w:color="auto" w:sz="0" w:space="0"/>
-          <w:bottom w:val="none" w:color="auto" w:sz="0" w:space="0"/>
-          <w:right w:val="none" w:color="auto" w:sz="0" w:space="0"/>
-          <w:between w:val="none" w:color="auto" w:sz="0" w:space="0"/>
-        </w:pBdr>
-        <w:spacing w:after="120" w:line="240" w:lineRule="auto"/>
-        <w:ind w:left="0" w:right="0" w:firstLine="0"/>
-        <w:jc w:val="left"/>
-        <w:rPr>
-          <w:rFonts w:hint="default" w:ascii="Times New Roman" w:hAnsi="Times New Roman" w:eastAsia="宋体" w:cs="Times New Roman"/>
-          <w:b w:val="0"/>
-          <w:color w:val="000000"/>
-          <w:sz w:val="21"/>
-          <w:u w:val="none"/>
-          <w:lang w:eastAsia="zh-CN"/>
-        </w:rPr>
-      </w:pPr>
-      <w:r>
-        <w:rPr>
-          <w:rFonts w:hint="default" w:ascii="Times New Roman" w:hAnsi="Times New Roman" w:eastAsia="宋体" w:cs="Times New Roman"/>
-          <w:b w:val="0"/>
-          <w:color w:val="000000"/>
-          <w:sz w:val="21"/>
-          <w:u w:val="none"/>
-          <w:lang w:eastAsia="zh-CN"/>
-        </w:rPr>
-        <w:t>参考资料：课程实验五报告模板；Android Developers的RecyclerView说明及1.4.0发行页；GitHub Docs的分支保护与PR说明。完整链接及测试证据见仓库README。</w:t>
       </w:r>
     </w:p>
     <w:p>
@@ -3548,6 +3440,7 @@
     <w:name w:val="页眉 字符"/>
     <w:basedOn w:val="6"/>
     <w:link w:val="3"/>
+    <w:qFormat/>
     <w:uiPriority w:val="0"/>
     <w:rPr>
       <w:kern w:val="2"/>
@@ -3559,6 +3452,7 @@
     <w:name w:val="页脚 字符"/>
     <w:basedOn w:val="6"/>
     <w:link w:val="2"/>
+    <w:qFormat/>
     <w:uiPriority w:val="0"/>
     <w:rPr>
       <w:kern w:val="2"/>

</xml_diff>